<commit_message>
Mark targets and refs as being in a digital and/or in a paper version [skip-ci]
</commit_message>
<xml_diff>
--- a/tests/_fixtures/docx2docx/02_assets_and_links.docx
+++ b/tests/_fixtures/docx2docx/02_assets_and_links.docx
@@ -725,11 +725,6 @@
         </w:tc>
       </w:tr>
     </w:tbl>
-    <w:p>
-      <w:pPr>
-        <w:pStyle w:val="BodyText"/>
-      </w:pPr>
-    </w:p>
     <w:p>
       <w:pPr>
         <w:pStyle w:val="Heading3"/>
@@ -1706,48 +1701,89 @@
         <w:pStyle w:val="BodyText"/>
       </w:pPr>
       <w:r>
+        <w:rPr>
+          <w:highlight w:val="lightGray"/>
+        </w:rPr>
         <w:t>Link to 1</w:t>
       </w:r>
       <w:r>
         <w:rPr>
+          <w:highlight w:val="lightGray"/>
           <w:vertAlign w:val="superscript"/>
         </w:rPr>
         <w:t>st</w:t>
       </w:r>
       <w:r>
-        <w:t xml:space="preserve"> asset (NOT on paper, 1</w:t>
-      </w:r>
-      <w:r>
-        <w:rPr>
+        <w:rPr>
+          <w:highlight w:val="lightGray"/>
+        </w:rPr>
+        <w:t xml:space="preserve"> </w:t>
+      </w:r>
+      <w:r>
+        <w:rPr>
+          <w:highlight w:val="lightGray"/>
+        </w:rPr>
+        <w:t>asset (NOT on paper, 1</w:t>
+      </w:r>
+      <w:r>
+        <w:rPr>
+          <w:highlight w:val="lightGray"/>
           <w:vertAlign w:val="superscript"/>
         </w:rPr>
         <w:t>st</w:t>
       </w:r>
       <w:r>
+        <w:rPr>
+          <w:highlight w:val="lightGray"/>
+        </w:rPr>
         <w:t xml:space="preserve"> in digital)</w:t>
       </w:r>
       <w:r>
+        <w:rPr>
+          <w:highlight w:val="lightGray"/>
+        </w:rPr>
         <w:t xml:space="preserve">: </w:t>
       </w:r>
       <w:r>
+        <w:rPr>
+          <w:highlight w:val="lightGray"/>
+        </w:rPr>
         <w:t xml:space="preserve">cross-ref </w:t>
       </w:r>
       <w:r>
+        <w:rPr>
+          <w:highlight w:val="lightGray"/>
+        </w:rPr>
         <w:fldChar w:fldCharType="begin"/>
       </w:r>
       <w:r>
+        <w:rPr>
+          <w:highlight w:val="lightGray"/>
+        </w:rPr>
         <w:instrText xml:space="preserve"> REF _Ref193102947 \h </w:instrText>
       </w:r>
       <w:r>
+        <w:rPr>
+          <w:highlight w:val="lightGray"/>
+        </w:rPr>
         <w:instrText xml:space="preserve"> \* MERGEFORMAT </w:instrText>
       </w:r>
       <w:r>
+        <w:rPr>
+          <w:highlight w:val="lightGray"/>
+        </w:rPr>
+      </w:r>
+      <w:r>
+        <w:rPr>
+          <w:highlight w:val="lightGray"/>
+        </w:rPr>
         <w:fldChar w:fldCharType="separate"/>
       </w:r>
       <w:r>
         <w:rPr>
           <w:b/>
           <w:bCs/>
+          <w:highlight w:val="lightGray"/>
         </w:rPr>
         <w:t xml:space="preserve">Figure </w:t>
       </w:r>
@@ -1756,19 +1792,27 @@
           <w:b/>
           <w:bCs/>
           <w:noProof/>
+          <w:highlight w:val="lightGray"/>
         </w:rPr>
         <w:t>1</w:t>
       </w:r>
       <w:r>
+        <w:rPr>
+          <w:highlight w:val="lightGray"/>
+        </w:rPr>
         <w:fldChar w:fldCharType="end"/>
       </w:r>
       <w:r>
+        <w:rPr>
+          <w:highlight w:val="lightGray"/>
+        </w:rPr>
         <w:t xml:space="preserve"> and </w:t>
       </w:r>
       <w:hyperlink w:anchor="figForDigital" w:history="1">
         <w:r>
           <w:rPr>
             <w:rStyle w:val="Hyperlink"/>
+            <w:highlight w:val="lightGray"/>
           </w:rPr>
           <w:t xml:space="preserve">link to </w:t>
         </w:r>
@@ -1776,25 +1820,15 @@
         <w:r>
           <w:rPr>
             <w:rStyle w:val="Hyperlink"/>
+            <w:highlight w:val="lightGray"/>
           </w:rPr>
-          <w:t>figFo</w:t>
-        </w:r>
-        <w:r>
-          <w:rPr>
-            <w:rStyle w:val="Hyperlink"/>
-          </w:rPr>
-          <w:t>r</w:t>
-        </w:r>
-        <w:r>
-          <w:rPr>
-            <w:rStyle w:val="Hyperlink"/>
-          </w:rPr>
-          <w:t>Digital</w:t>
+          <w:t>figForDigital</w:t>
         </w:r>
         <w:proofErr w:type="spellEnd"/>
         <w:r>
           <w:rPr>
             <w:rStyle w:val="Hyperlink"/>
+            <w:highlight w:val="lightGray"/>
           </w:rPr>
           <w:t xml:space="preserve"> bookmark</w:t>
         </w:r>
@@ -2007,6 +2041,505 @@
         <w:t xml:space="preserve"> </w:t>
       </w:r>
     </w:p>
+    <w:p>
+      <w:pPr>
+        <w:pStyle w:val="Heading3"/>
+      </w:pPr>
+      <w:r>
+        <w:lastRenderedPageBreak/>
+        <w:t>Assets Without References</w:t>
+      </w:r>
+    </w:p>
+    <w:p>
+      <w:pPr>
+        <w:pStyle w:val="BodyText"/>
+        <w:jc w:val="both"/>
+      </w:pPr>
+      <w:r>
+        <w:t>Content.</w:t>
+      </w:r>
+    </w:p>
+    <w:p>
+      <w:pPr>
+        <w:pStyle w:val="Caption"/>
+      </w:pPr>
+      <w:r>
+        <w:rPr>
+          <w:b/>
+          <w:bCs/>
+        </w:rPr>
+        <w:t xml:space="preserve">Figure </w:t>
+      </w:r>
+      <w:r>
+        <w:rPr>
+          <w:b/>
+          <w:bCs/>
+        </w:rPr>
+        <w:fldChar w:fldCharType="begin"/>
+      </w:r>
+      <w:r>
+        <w:rPr>
+          <w:b/>
+          <w:bCs/>
+        </w:rPr>
+        <w:instrText xml:space="preserve"> SEQ Figure \* ARABIC </w:instrText>
+      </w:r>
+      <w:r>
+        <w:rPr>
+          <w:b/>
+          <w:bCs/>
+        </w:rPr>
+        <w:fldChar w:fldCharType="separate"/>
+      </w:r>
+      <w:r>
+        <w:rPr>
+          <w:b/>
+          <w:bCs/>
+          <w:noProof/>
+        </w:rPr>
+        <w:t>4</w:t>
+      </w:r>
+      <w:r>
+        <w:rPr>
+          <w:b/>
+          <w:bCs/>
+        </w:rPr>
+        <w:fldChar w:fldCharType="end"/>
+      </w:r>
+      <w:r>
+        <w:rPr>
+          <w:b/>
+          <w:bCs/>
+        </w:rPr>
+        <w:t>:</w:t>
+      </w:r>
+      <w:r>
+        <w:t xml:space="preserve"> </w:t>
+      </w:r>
+      <w:r>
+        <w:t xml:space="preserve">Target without references. Make sure </w:t>
+      </w:r>
+      <w:r>
+        <w:t>the numbering is updated as well.</w:t>
+      </w:r>
+    </w:p>
+    <w:p>
+      <w:pPr>
+        <w:pStyle w:val="BodyText"/>
+        <w:jc w:val="both"/>
+      </w:pPr>
+      <w:r>
+        <w:rPr>
+          <w:noProof/>
+        </w:rPr>
+        <w:drawing>
+          <wp:inline distT="0" distB="0" distL="0" distR="0" wp14:anchorId="1AA7816D" wp14:editId="271D01B9">
+            <wp:extent cx="1397635" cy="1181100"/>
+            <wp:effectExtent l="0" t="0" r="0" b="0"/>
+            <wp:docPr id="1656303919" name="Picture 1656303919" descr="A red blue and grey text on a black background&#10;&#10;AI-generated content may be incorrect."/>
+            <wp:cNvGraphicFramePr>
+              <a:graphicFrameLocks xmlns:a="http://schemas.openxmlformats.org/drawingml/2006/main" noChangeAspect="1"/>
+            </wp:cNvGraphicFramePr>
+            <a:graphic xmlns:a="http://schemas.openxmlformats.org/drawingml/2006/main">
+              <a:graphicData uri="http://schemas.openxmlformats.org/drawingml/2006/picture">
+                <pic:pic xmlns:pic="http://schemas.openxmlformats.org/drawingml/2006/picture">
+                  <pic:nvPicPr>
+                    <pic:cNvPr id="1" name="Picture 1" descr="A red blue and grey text on a black background&#10;&#10;AI-generated content may be incorrect."/>
+                    <pic:cNvPicPr>
+                      <a:picLocks noChangeAspect="1" noChangeArrowheads="1"/>
+                    </pic:cNvPicPr>
+                  </pic:nvPicPr>
+                  <pic:blipFill>
+                    <a:blip r:embed="rId18">
+                      <a:extLst>
+                        <a:ext uri="{28A0092B-C50C-407E-A947-70E740481C1C}">
+                          <a14:useLocalDpi xmlns:a14="http://schemas.microsoft.com/office/drawing/2010/main" val="0"/>
+                        </a:ext>
+                      </a:extLst>
+                    </a:blip>
+                    <a:srcRect/>
+                    <a:stretch>
+                      <a:fillRect/>
+                    </a:stretch>
+                  </pic:blipFill>
+                  <pic:spPr bwMode="auto">
+                    <a:xfrm>
+                      <a:off x="0" y="0"/>
+                      <a:ext cx="1399740" cy="1182879"/>
+                    </a:xfrm>
+                    <a:prstGeom prst="rect">
+                      <a:avLst/>
+                    </a:prstGeom>
+                    <a:noFill/>
+                    <a:ln>
+                      <a:noFill/>
+                    </a:ln>
+                  </pic:spPr>
+                </pic:pic>
+              </a:graphicData>
+            </a:graphic>
+          </wp:inline>
+        </w:drawing>
+      </w:r>
+    </w:p>
+    <w:tbl>
+      <w:tblPr>
+        <w:tblW w:w="9345" w:type="dxa"/>
+        <w:tblBorders>
+          <w:top w:val="single" w:sz="4" w:space="0" w:color="auto"/>
+          <w:left w:val="single" w:sz="4" w:space="0" w:color="auto"/>
+          <w:bottom w:val="single" w:sz="4" w:space="0" w:color="auto"/>
+          <w:right w:val="single" w:sz="4" w:space="0" w:color="auto"/>
+          <w:insideH w:val="single" w:sz="4" w:space="0" w:color="auto"/>
+          <w:insideV w:val="single" w:sz="4" w:space="0" w:color="auto"/>
+        </w:tblBorders>
+        <w:tblCellMar>
+          <w:left w:w="0" w:type="dxa"/>
+          <w:right w:w="0" w:type="dxa"/>
+        </w:tblCellMar>
+        <w:tblLook w:val="04A0" w:firstRow="1" w:lastRow="0" w:firstColumn="1" w:lastColumn="0" w:noHBand="0" w:noVBand="1"/>
+      </w:tblPr>
+      <w:tblGrid>
+        <w:gridCol w:w="1345"/>
+        <w:gridCol w:w="8000"/>
+      </w:tblGrid>
+      <w:tr>
+        <w:trPr>
+          <w:trHeight w:val="300"/>
+        </w:trPr>
+        <w:tc>
+          <w:tcPr>
+            <w:tcW w:w="1345" w:type="dxa"/>
+            <w:shd w:val="clear" w:color="auto" w:fill="auto"/>
+            <w:hideMark/>
+          </w:tcPr>
+          <w:p>
+            <w:pPr>
+              <w:spacing w:after="0"/>
+              <w:textAlignment w:val="baseline"/>
+              <w:rPr>
+                <w:rFonts w:ascii="Times New Roman" w:eastAsia="Times New Roman" w:hAnsi="Times New Roman" w:cs="Times New Roman"/>
+                <w:b/>
+                <w:bCs/>
+                <w:sz w:val="16"/>
+                <w:szCs w:val="16"/>
+              </w:rPr>
+            </w:pPr>
+            <w:r>
+              <w:rPr>
+                <w:sz w:val="16"/>
+                <w:szCs w:val="16"/>
+              </w:rPr>
+              <w:t>##Digital-input</w:t>
+            </w:r>
+          </w:p>
+        </w:tc>
+        <w:tc>
+          <w:tcPr>
+            <w:tcW w:w="8000" w:type="dxa"/>
+            <w:shd w:val="clear" w:color="auto" w:fill="auto"/>
+          </w:tcPr>
+          <w:p>
+            <w:pPr>
+              <w:spacing w:after="0"/>
+              <w:textAlignment w:val="baseline"/>
+              <w:rPr>
+                <w:rFonts w:ascii="Calibri" w:eastAsia="Times New Roman" w:hAnsi="Calibri" w:cs="Calibri"/>
+                <w:sz w:val="16"/>
+                <w:szCs w:val="16"/>
+                <w:lang w:val="fr-FR"/>
+              </w:rPr>
+            </w:pPr>
+            <w:r>
+              <w:rPr>
+                <w:sz w:val="16"/>
+                <w:szCs w:val="16"/>
+                <w:lang w:val="fr-FR"/>
+              </w:rPr>
+              <w:t>./</w:t>
+            </w:r>
+            <w:del w:id="12" w:author="Pawel KAMINSKI" w:date="2024-06-17T11:16:00Z">
+              <w:r>
+                <w:rPr>
+                  <w:sz w:val="16"/>
+                  <w:szCs w:val="16"/>
+                  <w:lang w:val="fr-FR"/>
+                </w:rPr>
+                <w:delText>images</w:delText>
+              </w:r>
+            </w:del>
+            <w:ins w:id="13" w:author="Pawel KAMINSKI" w:date="2024-06-17T11:16:00Z">
+              <w:r>
+                <w:rPr>
+                  <w:sz w:val="16"/>
+                  <w:szCs w:val="16"/>
+                  <w:lang w:val="fr-FR"/>
+                </w:rPr>
+                <w:t>assets</w:t>
+              </w:r>
+            </w:ins>
+            <w:r>
+              <w:rPr>
+                <w:sz w:val="16"/>
+                <w:szCs w:val="16"/>
+                <w:lang w:val="fr-FR"/>
+              </w:rPr>
+              <w:t>/</w:t>
+            </w:r>
+            <w:proofErr w:type="spellStart"/>
+            <w:r>
+              <w:rPr>
+                <w:sz w:val="16"/>
+                <w:szCs w:val="16"/>
+                <w:lang w:val="fr-FR"/>
+              </w:rPr>
+              <w:t>common</w:t>
+            </w:r>
+            <w:proofErr w:type="spellEnd"/>
+            <w:ins w:id="14" w:author="Pawel KAMINSKI" w:date="2024-06-17T11:17:00Z">
+              <w:r>
+                <w:rPr>
+                  <w:sz w:val="16"/>
+                  <w:szCs w:val="16"/>
+                  <w:lang w:val="fr-FR"/>
+                </w:rPr>
+                <w:t>/</w:t>
+              </w:r>
+            </w:ins>
+            <w:r>
+              <w:rPr>
+                <w:sz w:val="16"/>
+                <w:szCs w:val="16"/>
+                <w:lang w:val="fr-FR"/>
+              </w:rPr>
+              <w:t>uni_logo.png</w:t>
+            </w:r>
+          </w:p>
+        </w:tc>
+      </w:tr>
+      <w:tr>
+        <w:trPr>
+          <w:trHeight w:val="300"/>
+        </w:trPr>
+        <w:tc>
+          <w:tcPr>
+            <w:tcW w:w="1345" w:type="dxa"/>
+            <w:shd w:val="clear" w:color="auto" w:fill="auto"/>
+          </w:tcPr>
+          <w:p>
+            <w:pPr>
+              <w:spacing w:after="0"/>
+              <w:textAlignment w:val="baseline"/>
+              <w:rPr>
+                <w:rFonts w:ascii="Calibri" w:eastAsia="Times New Roman" w:hAnsi="Calibri" w:cs="Calibri"/>
+                <w:sz w:val="16"/>
+                <w:szCs w:val="16"/>
+              </w:rPr>
+            </w:pPr>
+            <w:r>
+              <w:rPr>
+                <w:sz w:val="16"/>
+                <w:szCs w:val="16"/>
+              </w:rPr>
+              <w:t>##Paper-input</w:t>
+            </w:r>
+          </w:p>
+        </w:tc>
+        <w:tc>
+          <w:tcPr>
+            <w:tcW w:w="8000" w:type="dxa"/>
+            <w:shd w:val="clear" w:color="auto" w:fill="auto"/>
+          </w:tcPr>
+          <w:p>
+            <w:pPr>
+              <w:spacing w:after="0"/>
+              <w:textAlignment w:val="baseline"/>
+              <w:rPr>
+                <w:rFonts w:ascii="Calibri" w:eastAsia="Times New Roman" w:hAnsi="Calibri" w:cs="Calibri"/>
+                <w:sz w:val="16"/>
+                <w:szCs w:val="16"/>
+                <w:lang w:val="fr-FR"/>
+              </w:rPr>
+            </w:pPr>
+            <w:r>
+              <w:rPr>
+                <w:sz w:val="16"/>
+                <w:szCs w:val="16"/>
+                <w:lang w:val="fr-FR"/>
+              </w:rPr>
+              <w:t>./</w:t>
+            </w:r>
+            <w:del w:id="15" w:author="Pawel KAMINSKI" w:date="2024-06-17T11:16:00Z">
+              <w:r>
+                <w:rPr>
+                  <w:sz w:val="16"/>
+                  <w:szCs w:val="16"/>
+                  <w:lang w:val="fr-FR"/>
+                </w:rPr>
+                <w:delText>images</w:delText>
+              </w:r>
+            </w:del>
+            <w:ins w:id="16" w:author="Pawel KAMINSKI" w:date="2024-06-17T11:16:00Z">
+              <w:r>
+                <w:rPr>
+                  <w:sz w:val="16"/>
+                  <w:szCs w:val="16"/>
+                  <w:lang w:val="fr-FR"/>
+                </w:rPr>
+                <w:t>assets</w:t>
+              </w:r>
+            </w:ins>
+            <w:r>
+              <w:rPr>
+                <w:sz w:val="16"/>
+                <w:szCs w:val="16"/>
+                <w:lang w:val="fr-FR"/>
+              </w:rPr>
+              <w:t>/</w:t>
+            </w:r>
+            <w:proofErr w:type="spellStart"/>
+            <w:r>
+              <w:rPr>
+                <w:sz w:val="16"/>
+                <w:szCs w:val="16"/>
+                <w:lang w:val="fr-FR"/>
+              </w:rPr>
+              <w:t>common</w:t>
+            </w:r>
+            <w:proofErr w:type="spellEnd"/>
+            <w:ins w:id="17" w:author="Pawel KAMINSKI" w:date="2024-06-17T11:17:00Z">
+              <w:r>
+                <w:rPr>
+                  <w:sz w:val="16"/>
+                  <w:szCs w:val="16"/>
+                  <w:lang w:val="fr-FR"/>
+                </w:rPr>
+                <w:t>/</w:t>
+              </w:r>
+            </w:ins>
+            <w:r>
+              <w:rPr>
+                <w:sz w:val="16"/>
+                <w:szCs w:val="16"/>
+                <w:lang w:val="fr-FR"/>
+              </w:rPr>
+              <w:t>uni_logo.png</w:t>
+            </w:r>
+          </w:p>
+        </w:tc>
+      </w:tr>
+      <w:tr>
+        <w:trPr>
+          <w:trHeight w:val="300"/>
+        </w:trPr>
+        <w:tc>
+          <w:tcPr>
+            <w:tcW w:w="1345" w:type="dxa"/>
+            <w:shd w:val="clear" w:color="auto" w:fill="auto"/>
+          </w:tcPr>
+          <w:p>
+            <w:pPr>
+              <w:spacing w:after="0"/>
+              <w:textAlignment w:val="baseline"/>
+              <w:rPr>
+                <w:rFonts w:ascii="Calibri" w:eastAsia="Times New Roman" w:hAnsi="Calibri" w:cs="Calibri"/>
+                <w:sz w:val="16"/>
+                <w:szCs w:val="16"/>
+                <w:lang w:val="fr-FR"/>
+              </w:rPr>
+            </w:pPr>
+            <w:r>
+              <w:rPr>
+                <w:sz w:val="16"/>
+                <w:szCs w:val="16"/>
+              </w:rPr>
+              <w:t>##Source</w:t>
+            </w:r>
+          </w:p>
+        </w:tc>
+        <w:tc>
+          <w:tcPr>
+            <w:tcW w:w="8000" w:type="dxa"/>
+            <w:shd w:val="clear" w:color="auto" w:fill="auto"/>
+          </w:tcPr>
+          <w:p>
+            <w:pPr>
+              <w:spacing w:after="0"/>
+              <w:textAlignment w:val="baseline"/>
+              <w:rPr>
+                <w:rFonts w:ascii="Calibri" w:eastAsia="Times New Roman" w:hAnsi="Calibri" w:cs="Calibri"/>
+                <w:sz w:val="16"/>
+                <w:szCs w:val="16"/>
+                <w:lang w:val="fr-FR"/>
+              </w:rPr>
+            </w:pPr>
+            <w:r>
+              <w:rPr>
+                <w:rFonts w:cstheme="majorHAnsi"/>
+                <w:sz w:val="16"/>
+                <w:szCs w:val="16"/>
+                <w:lang w:val="fr-FR"/>
+              </w:rPr>
+              <w:t>https://en.m.wikipedia.org/wiki/File:University_of_Luxembourg_logo_(fr).svg</w:t>
+            </w:r>
+          </w:p>
+        </w:tc>
+      </w:tr>
+      <w:tr>
+        <w:trPr>
+          <w:trHeight w:val="300"/>
+        </w:trPr>
+        <w:tc>
+          <w:tcPr>
+            <w:tcW w:w="1345" w:type="dxa"/>
+            <w:shd w:val="clear" w:color="auto" w:fill="auto"/>
+          </w:tcPr>
+          <w:p>
+            <w:pPr>
+              <w:spacing w:after="0"/>
+              <w:textAlignment w:val="baseline"/>
+              <w:rPr>
+                <w:rFonts w:ascii="Calibri" w:eastAsia="Times New Roman" w:hAnsi="Calibri" w:cs="Calibri"/>
+                <w:sz w:val="16"/>
+                <w:szCs w:val="16"/>
+              </w:rPr>
+            </w:pPr>
+            <w:r>
+              <w:rPr>
+                <w:sz w:val="16"/>
+                <w:szCs w:val="16"/>
+              </w:rPr>
+              <w:t>##Alt-text</w:t>
+            </w:r>
+          </w:p>
+        </w:tc>
+        <w:tc>
+          <w:tcPr>
+            <w:tcW w:w="8000" w:type="dxa"/>
+            <w:shd w:val="clear" w:color="auto" w:fill="auto"/>
+          </w:tcPr>
+          <w:p>
+            <w:pPr>
+              <w:spacing w:after="0"/>
+              <w:textAlignment w:val="baseline"/>
+              <w:rPr>
+                <w:rFonts w:ascii="Calibri" w:eastAsia="Times New Roman" w:hAnsi="Calibri" w:cs="Calibri"/>
+                <w:sz w:val="16"/>
+                <w:szCs w:val="16"/>
+              </w:rPr>
+            </w:pPr>
+            <w:r>
+              <w:rPr>
+                <w:rFonts w:eastAsia="Times New Roman" w:cstheme="majorHAnsi"/>
+                <w:sz w:val="16"/>
+                <w:szCs w:val="16"/>
+              </w:rPr>
+              <w:t>Logo of University of Luxembourg in French pointing to the uni.lu website</w:t>
+            </w:r>
+          </w:p>
+        </w:tc>
+      </w:tr>
+    </w:tbl>
     <w:p>
       <w:pPr>
         <w:pStyle w:val="BodyText"/>
@@ -5014,7 +5547,7 @@
   <w:style w:type="paragraph" w:default="1" w:styleId="Normal">
     <w:name w:val="Normal"/>
     <w:qFormat/>
-    <w:rsid w:val="00A3641E"/>
+    <w:rsid w:val="00DC01A2"/>
   </w:style>
   <w:style w:type="paragraph" w:styleId="Heading1">
     <w:name w:val="heading 1"/>

</xml_diff>

<commit_message>
Modify to markdown transformation so that there is no newline after a only-for-digital class attribute
</commit_message>
<xml_diff>
--- a/tests/_fixtures/docx2docx/02_assets_and_links.docx
+++ b/tests/_fixtures/docx2docx/02_assets_and_links.docx
@@ -1842,63 +1842,107 @@
         <w:pStyle w:val="BodyText"/>
       </w:pPr>
       <w:r>
+        <w:rPr>
+          <w:highlight w:val="cyan"/>
+        </w:rPr>
         <w:t xml:space="preserve">Link to </w:t>
       </w:r>
       <w:r>
+        <w:rPr>
+          <w:highlight w:val="cyan"/>
+        </w:rPr>
         <w:t>2</w:t>
       </w:r>
       <w:r>
         <w:rPr>
+          <w:highlight w:val="cyan"/>
           <w:vertAlign w:val="superscript"/>
         </w:rPr>
         <w:t>nd</w:t>
       </w:r>
       <w:r>
+        <w:rPr>
+          <w:highlight w:val="cyan"/>
+        </w:rPr>
         <w:t xml:space="preserve"> </w:t>
       </w:r>
       <w:r>
+        <w:rPr>
+          <w:highlight w:val="cyan"/>
+        </w:rPr>
         <w:t>asset (</w:t>
       </w:r>
       <w:r>
+        <w:rPr>
+          <w:highlight w:val="cyan"/>
+        </w:rPr>
         <w:t>1</w:t>
       </w:r>
       <w:r>
         <w:rPr>
+          <w:highlight w:val="cyan"/>
           <w:vertAlign w:val="superscript"/>
         </w:rPr>
         <w:t>st</w:t>
       </w:r>
       <w:r>
+        <w:rPr>
+          <w:highlight w:val="cyan"/>
+        </w:rPr>
         <w:t xml:space="preserve"> </w:t>
       </w:r>
       <w:r>
+        <w:rPr>
+          <w:highlight w:val="cyan"/>
+        </w:rPr>
         <w:t>on paper</w:t>
       </w:r>
       <w:r>
+        <w:rPr>
+          <w:highlight w:val="cyan"/>
+        </w:rPr>
         <w:t>, NOT in digital)</w:t>
       </w:r>
       <w:r>
+        <w:rPr>
+          <w:highlight w:val="cyan"/>
+        </w:rPr>
         <w:t xml:space="preserve">: </w:t>
       </w:r>
       <w:r>
+        <w:rPr>
+          <w:highlight w:val="cyan"/>
+        </w:rPr>
         <w:t xml:space="preserve">cross-ref </w:t>
       </w:r>
       <w:r>
+        <w:rPr>
+          <w:highlight w:val="cyan"/>
+        </w:rPr>
         <w:fldChar w:fldCharType="begin"/>
       </w:r>
       <w:r>
-        <w:instrText xml:space="preserve"> REF _Ref193102988 \h </w:instrText>
-      </w:r>
-      <w:r>
-        <w:instrText xml:space="preserve"> \* MERGEFORMAT </w:instrText>
-      </w:r>
-      <w:r>
+        <w:rPr>
+          <w:highlight w:val="cyan"/>
+        </w:rPr>
+        <w:instrText xml:space="preserve"> REF _Ref193102988 \h  \* MERGEFORMAT </w:instrText>
+      </w:r>
+      <w:r>
+        <w:rPr>
+          <w:highlight w:val="cyan"/>
+        </w:rPr>
+      </w:r>
+      <w:r>
+        <w:rPr>
+          <w:highlight w:val="cyan"/>
+        </w:rPr>
         <w:fldChar w:fldCharType="separate"/>
       </w:r>
       <w:r>
         <w:rPr>
           <w:b/>
           <w:bCs/>
+          <w:highlight w:val="cyan"/>
         </w:rPr>
         <w:t xml:space="preserve">Figure </w:t>
       </w:r>
@@ -1907,19 +1951,27 @@
           <w:b/>
           <w:bCs/>
           <w:noProof/>
+          <w:highlight w:val="cyan"/>
         </w:rPr>
         <w:t>2</w:t>
       </w:r>
       <w:r>
+        <w:rPr>
+          <w:highlight w:val="cyan"/>
+        </w:rPr>
         <w:fldChar w:fldCharType="end"/>
       </w:r>
       <w:r>
+        <w:rPr>
+          <w:highlight w:val="cyan"/>
+        </w:rPr>
         <w:t xml:space="preserve"> and </w:t>
       </w:r>
       <w:hyperlink w:anchor="figForPaper" w:history="1">
         <w:r>
           <w:rPr>
             <w:rStyle w:val="Hyperlink"/>
+            <w:highlight w:val="cyan"/>
           </w:rPr>
           <w:t xml:space="preserve">link to </w:t>
         </w:r>
@@ -1927,6 +1979,7 @@
         <w:r>
           <w:rPr>
             <w:rStyle w:val="Hyperlink"/>
+            <w:highlight w:val="cyan"/>
           </w:rPr>
           <w:t>figForPaper</w:t>
         </w:r>
@@ -1934,6 +1987,7 @@
         <w:r>
           <w:rPr>
             <w:rStyle w:val="Hyperlink"/>
+            <w:highlight w:val="cyan"/>
           </w:rPr>
           <w:t xml:space="preserve"> bookmark</w:t>
         </w:r>

</xml_diff>